<commit_message>
Unifica los 7 instrumentos (plantilla UDES + portada APA 7) y elimina la raya em
- Reconstruye UNE 71362 (RED1/RED2) y COdA-IP (CMMS) sobre la plantilla
  UDES original (logos, tablas verdes), igual que los COdA/LORI
- Completa portada (titulo, autor, programa, ciudad, ano), repositorio,
  URL, puntuacion final, conclusiones, ventajas y desventajas
- Alinea puntajes con los anexos del Entregable 1
- Elimina la raya em de todas las paginas del sitio (reemplazos contextuales)

Co-Authored-By: Claude Opus 4.8 (1M context) <noreply@anthropic.com>
</commit_message>
<xml_diff>
--- a/assets/docs/Evaluacion_COdA_RED1.docx
+++ b/assets/docs/Evaluacion_COdA_RED1.docx
@@ -51,21 +51,7 @@
           <w:rFonts w:ascii="Arial" w:hAnsi="Arial" w:cs="Arial"/>
           <w:b/>
         </w:rPr>
-        <w:t xml:space="preserve">Título del </w:t>
-      </w:r>
-      <w:r>
-        <w:rPr>
-          <w:rFonts w:ascii="Arial" w:hAnsi="Arial" w:cs="Arial"/>
-          <w:b/>
-        </w:rPr>
-        <w:t>e</w:t>
-      </w:r>
-      <w:r>
-        <w:rPr>
-          <w:rFonts w:ascii="Arial" w:hAnsi="Arial" w:cs="Arial"/>
-          <w:b/>
-        </w:rPr>
-        <w:t xml:space="preserve">ntregable </w:t>
+        <w:t xml:space="preserve">Evaluación de la calidad del recurso educativo digital «Propiedades de los gases» (PhET) mediante el modelo COdA</w:t>
       </w:r>
     </w:p>
     <w:p>
@@ -141,7 +127,7 @@
           <w:sz w:val="22"/>
           <w:szCs w:val="22"/>
         </w:rPr>
-        <w:t>Apellidos y nombres completos del autor(es)</w:t>
+        <w:t>Marlon Joaquín Gómez Argüello</w:t>
       </w:r>
     </w:p>
     <w:p>
@@ -165,7 +151,7 @@
           <w:sz w:val="22"/>
           <w:szCs w:val="22"/>
         </w:rPr>
-        <w:t xml:space="preserve"> (En orden alfabético por apellido separado con la letra “y”)</w:t>
+        <w:t xml:space="preserve"/>
       </w:r>
     </w:p>
     <w:p>
@@ -283,7 +269,7 @@
           <w:sz w:val="22"/>
           <w:szCs w:val="22"/>
         </w:rPr>
-        <w:t>Nombre del programa académico</w:t>
+        <w:t>Especialización en Aplicación de TIC para la Enseñanza</w:t>
       </w:r>
     </w:p>
     <w:p>
@@ -301,7 +287,7 @@
           <w:sz w:val="22"/>
           <w:szCs w:val="22"/>
         </w:rPr>
-        <w:t>Ciudad</w:t>
+        <w:t>Bucaramanga</w:t>
       </w:r>
     </w:p>
     <w:p>
@@ -319,7 +305,7 @@
           <w:sz w:val="22"/>
           <w:szCs w:val="22"/>
         </w:rPr>
-        <w:t>Año</w:t>
+        <w:t>2026</w:t>
       </w:r>
     </w:p>
     <w:p>
@@ -455,43 +441,7 @@
               <w:rPr>
                 <w:rFonts w:ascii="Arial" w:hAnsi="Arial" w:cs="Arial"/>
               </w:rPr>
-              <w:t xml:space="preserve">Nombre del </w:t>
-            </w:r>
-            <w:r>
-              <w:rPr>
-                <w:rFonts w:ascii="Arial" w:hAnsi="Arial" w:cs="Arial"/>
-              </w:rPr>
-              <w:t>r</w:t>
-            </w:r>
-            <w:r>
-              <w:rPr>
-                <w:rFonts w:ascii="Arial" w:hAnsi="Arial" w:cs="Arial"/>
-              </w:rPr>
-              <w:t xml:space="preserve">ecurso </w:t>
-            </w:r>
-            <w:r>
-              <w:rPr>
-                <w:rFonts w:ascii="Arial" w:hAnsi="Arial" w:cs="Arial"/>
-              </w:rPr>
-              <w:t>e</w:t>
-            </w:r>
-            <w:r>
-              <w:rPr>
-                <w:rFonts w:ascii="Arial" w:hAnsi="Arial" w:cs="Arial"/>
-              </w:rPr>
-              <w:t>ducativo</w:t>
-            </w:r>
-            <w:r>
-              <w:rPr>
-                <w:rFonts w:ascii="Arial" w:hAnsi="Arial" w:cs="Arial"/>
-              </w:rPr>
-              <w:t xml:space="preserve"> digital</w:t>
-            </w:r>
-            <w:r>
-              <w:rPr>
-                <w:rFonts w:ascii="Arial" w:hAnsi="Arial" w:cs="Arial"/>
-              </w:rPr>
-              <w:t>:</w:t>
+              <w:t>Nombre del recurso educativo digital:</w:t>
             </w:r>
           </w:p>
         </w:tc>
@@ -525,19 +475,7 @@
               <w:rPr>
                 <w:rFonts w:ascii="Arial" w:hAnsi="Arial" w:cs="Arial"/>
               </w:rPr>
-              <w:t xml:space="preserve">Grado de </w:t>
-            </w:r>
-            <w:r>
-              <w:rPr>
-                <w:rFonts w:ascii="Arial" w:hAnsi="Arial" w:cs="Arial"/>
-              </w:rPr>
-              <w:t>a</w:t>
-            </w:r>
-            <w:r>
-              <w:rPr>
-                <w:rFonts w:ascii="Arial" w:hAnsi="Arial" w:cs="Arial"/>
-              </w:rPr>
-              <w:t>plicación:</w:t>
+              <w:t>Grado de aplicación:</w:t>
             </w:r>
           </w:p>
         </w:tc>
@@ -608,19 +546,7 @@
               <w:rPr>
                 <w:rFonts w:ascii="Arial" w:hAnsi="Arial" w:cs="Arial"/>
               </w:rPr>
-              <w:t xml:space="preserve">Objetivos de </w:t>
-            </w:r>
-            <w:r>
-              <w:rPr>
-                <w:rFonts w:ascii="Arial" w:hAnsi="Arial" w:cs="Arial"/>
-              </w:rPr>
-              <w:t>a</w:t>
-            </w:r>
-            <w:r>
-              <w:rPr>
-                <w:rFonts w:ascii="Arial" w:hAnsi="Arial" w:cs="Arial"/>
-              </w:rPr>
-              <w:t>prendizaje:</w:t>
+              <w:t>Objetivos de aprendizaje:</w:t>
             </w:r>
           </w:p>
         </w:tc>
@@ -655,19 +581,7 @@
               <w:rPr>
                 <w:rFonts w:ascii="Arial" w:hAnsi="Arial" w:cs="Arial"/>
               </w:rPr>
-              <w:t xml:space="preserve">Nombre del </w:t>
-            </w:r>
-            <w:r>
-              <w:rPr>
-                <w:rFonts w:ascii="Arial" w:hAnsi="Arial" w:cs="Arial"/>
-              </w:rPr>
-              <w:t>repositorio</w:t>
-            </w:r>
-            <w:r>
-              <w:rPr>
-                <w:rFonts w:ascii="Arial" w:hAnsi="Arial" w:cs="Arial"/>
-              </w:rPr>
-              <w:t>:</w:t>
+              <w:t>Nombre del repositorio:</w:t>
             </w:r>
           </w:p>
         </w:tc>
@@ -677,13 +591,12 @@
             <w:shd w:val="clear" w:color="auto" w:fill="auto"/>
           </w:tcPr>
           <w:p>
-            <w:pPr>
-              <w:spacing w:line="240" w:lineRule="auto"/>
-              <w:jc w:val="both"/>
-              <w:rPr>
-                <w:rFonts w:ascii="Arial" w:eastAsia="Arial" w:hAnsi="Arial" w:cs="Arial"/>
-              </w:rPr>
-            </w:pPr>
+            <w:r>
+              <w:rPr>
+                <w:rFonts w:ascii="Arial" w:hAnsi="Arial" w:cs="Arial"/>
+              </w:rPr>
+              <w:t xml:space="preserve">PhET Interactive Simulations (Universidad de Colorado Boulder)</w:t>
+            </w:r>
           </w:p>
         </w:tc>
       </w:tr>
@@ -706,19 +619,7 @@
               <w:rPr>
                 <w:rFonts w:ascii="Arial" w:hAnsi="Arial" w:cs="Arial"/>
               </w:rPr>
-              <w:t xml:space="preserve">URL del </w:t>
-            </w:r>
-            <w:r>
-              <w:rPr>
-                <w:rFonts w:ascii="Arial" w:hAnsi="Arial" w:cs="Arial"/>
-              </w:rPr>
-              <w:t>recurso educativo digital</w:t>
-            </w:r>
-            <w:r>
-              <w:rPr>
-                <w:rFonts w:ascii="Arial" w:hAnsi="Arial" w:cs="Arial"/>
-              </w:rPr>
-              <w:t>:</w:t>
+              <w:t>URL del recurso educativo digital:</w:t>
             </w:r>
           </w:p>
         </w:tc>
@@ -728,13 +629,12 @@
             <w:shd w:val="clear" w:color="auto" w:fill="auto"/>
           </w:tcPr>
           <w:p>
-            <w:pPr>
-              <w:spacing w:line="240" w:lineRule="auto"/>
-              <w:jc w:val="both"/>
-              <w:rPr>
-                <w:rFonts w:ascii="Arial" w:eastAsia="Arial" w:hAnsi="Arial" w:cs="Arial"/>
-              </w:rPr>
-            </w:pPr>
+            <w:r>
+              <w:rPr>
+                <w:rFonts w:ascii="Arial" w:hAnsi="Arial" w:cs="Arial"/>
+              </w:rPr>
+              <w:t xml:space="preserve">https://phet.colorado.edu/es/simulations/gas-properties</w:t>
+            </w:r>
           </w:p>
         </w:tc>
       </w:tr>
@@ -792,28 +692,7 @@
                 <w:rFonts w:ascii="Arial" w:hAnsi="Arial" w:cs="Arial"/>
                 <w:b/>
               </w:rPr>
-              <w:t>Descripción de</w:t>
-            </w:r>
-            <w:r>
-              <w:rPr>
-                <w:rFonts w:ascii="Arial" w:hAnsi="Arial" w:cs="Arial"/>
-                <w:b/>
-              </w:rPr>
-              <w:t xml:space="preserve">l </w:t>
-            </w:r>
-            <w:r>
-              <w:rPr>
-                <w:rFonts w:ascii="Arial" w:hAnsi="Arial" w:cs="Arial"/>
-                <w:b/>
-              </w:rPr>
-              <w:t xml:space="preserve">recurso educativo </w:t>
-            </w:r>
-            <w:r>
-              <w:rPr>
-                <w:rFonts w:ascii="Arial" w:hAnsi="Arial" w:cs="Arial"/>
-                <w:b/>
-              </w:rPr>
-              <w:t>digital</w:t>
+              <w:t>Descripción del recurso educativo digital</w:t>
             </w:r>
           </w:p>
         </w:tc>
@@ -909,26 +788,12 @@
               </w:rPr>
               <w:t xml:space="preserve">Modelo: </w:t>
             </w:r>
-            <w:proofErr w:type="spellStart"/>
-            <w:r>
-              <w:rPr>
-                <w:rFonts w:ascii="Arial" w:hAnsi="Arial" w:cs="Arial"/>
-              </w:rPr>
-              <w:t>CO</w:t>
-            </w:r>
-            <w:r>
-              <w:rPr>
-                <w:rFonts w:ascii="Arial" w:hAnsi="Arial" w:cs="Arial"/>
-              </w:rPr>
-              <w:t>d</w:t>
-            </w:r>
-            <w:r>
-              <w:rPr>
-                <w:rFonts w:ascii="Arial" w:hAnsi="Arial" w:cs="Arial"/>
-              </w:rPr>
-              <w:t>A</w:t>
-            </w:r>
-            <w:proofErr w:type="spellEnd"/>
+            <w:r>
+              <w:rPr>
+                <w:rFonts w:ascii="Arial" w:hAnsi="Arial" w:cs="Arial"/>
+              </w:rPr>
+              <w:t>COdA</w:t>
+            </w:r>
           </w:p>
         </w:tc>
       </w:tr>
@@ -1628,21 +1493,7 @@
                 <w:rFonts w:ascii="Arial" w:hAnsi="Arial" w:cs="Arial"/>
                 <w:b/>
               </w:rPr>
-              <w:t xml:space="preserve">3. Capacidad de </w:t>
-            </w:r>
-            <w:r>
-              <w:rPr>
-                <w:rFonts w:ascii="Arial" w:hAnsi="Arial" w:cs="Arial"/>
-                <w:b/>
-              </w:rPr>
-              <w:t>g</w:t>
-            </w:r>
-            <w:r>
-              <w:rPr>
-                <w:rFonts w:ascii="Arial" w:hAnsi="Arial" w:cs="Arial"/>
-                <w:b/>
-              </w:rPr>
-              <w:t>enerar reflexión, críticas e innovación</w:t>
+              <w:t>3. Capacidad de generar reflexión, críticas e innovación</w:t>
             </w:r>
           </w:p>
         </w:tc>
@@ -3078,7 +2929,7 @@
                 <w:b/>
                 <w:color w:val="000000"/>
               </w:rPr>
-              <w:t xml:space="preserve">Resultados de la de </w:t>
+              <w:t xml:space="preserve">Resultados de la </w:t>
             </w:r>
             <w:r>
               <w:rPr>
@@ -3108,21 +2959,7 @@
                 <w:rFonts w:ascii="Arial" w:hAnsi="Arial" w:cs="Arial"/>
                 <w:b/>
               </w:rPr>
-              <w:t xml:space="preserve">Puntuación </w:t>
-            </w:r>
-            <w:r>
-              <w:rPr>
-                <w:rFonts w:ascii="Arial" w:hAnsi="Arial" w:cs="Arial"/>
-                <w:b/>
-              </w:rPr>
-              <w:t>f</w:t>
-            </w:r>
-            <w:r>
-              <w:rPr>
-                <w:rFonts w:ascii="Arial" w:hAnsi="Arial" w:cs="Arial"/>
-                <w:b/>
-              </w:rPr>
-              <w:t xml:space="preserve">inal: </w:t>
+              <w:t xml:space="preserve">Puntuación final: 46 / 50</w:t>
             </w:r>
           </w:p>
         </w:tc>
@@ -3145,21 +2982,7 @@
                 <w:rFonts w:ascii="Arial" w:hAnsi="Arial" w:cs="Arial"/>
                 <w:bCs/>
               </w:rPr>
-              <w:t xml:space="preserve">Conclusiones de la </w:t>
-            </w:r>
-            <w:r>
-              <w:rPr>
-                <w:rFonts w:ascii="Arial" w:hAnsi="Arial" w:cs="Arial"/>
-                <w:bCs/>
-              </w:rPr>
-              <w:t>e</w:t>
-            </w:r>
-            <w:r>
-              <w:rPr>
-                <w:rFonts w:ascii="Arial" w:hAnsi="Arial" w:cs="Arial"/>
-                <w:bCs/>
-              </w:rPr>
-              <w:t>valuación:</w:t>
+              <w:t>Conclusiones de la evaluación: El recurso obtiene una calidad alta en las dimensiones didáctica y tecnológica. Destaca en interactividad, usabilidad, accesibilidad y diseño; los puntajes menores corresponden a la calidad de contenidos, la motivación, la reusabilidad y la interoperabilidad, por tratarse de un modelo simplificado del comportamiento de los gases.</w:t>
             </w:r>
           </w:p>
           <w:p>
@@ -3246,28 +3069,7 @@
                 <w:rFonts w:ascii="Arial" w:hAnsi="Arial" w:cs="Arial"/>
                 <w:color w:val="000000"/>
               </w:rPr>
-              <w:t>Nombre del</w:t>
-            </w:r>
-            <w:r>
-              <w:rPr>
-                <w:rFonts w:ascii="Arial" w:hAnsi="Arial" w:cs="Arial"/>
-                <w:color w:val="000000"/>
-              </w:rPr>
-              <w:t>(os)</w:t>
-            </w:r>
-            <w:r>
-              <w:rPr>
-                <w:rFonts w:ascii="Arial" w:hAnsi="Arial" w:cs="Arial"/>
-                <w:color w:val="000000"/>
-              </w:rPr>
-              <w:t xml:space="preserve"> estudiante</w:t>
-            </w:r>
-            <w:r>
-              <w:rPr>
-                <w:rFonts w:ascii="Arial" w:hAnsi="Arial" w:cs="Arial"/>
-                <w:color w:val="000000"/>
-              </w:rPr>
-              <w:t>(s)</w:t>
+              <w:t>Nombre del(os) estudiante(s)</w:t>
             </w:r>
           </w:p>
         </w:tc>
@@ -3345,68 +3147,18 @@
           <w:rFonts w:ascii="Arial" w:hAnsi="Arial" w:cs="Arial"/>
           <w:color w:val="666666"/>
         </w:rPr>
-        <w:t xml:space="preserve">Modelo </w:t>
+        <w:t>Modelo COdA adaptado por Dajer (2021)</w:t>
       </w:r>
-      <w:proofErr w:type="spellStart"/>
-      <w:r>
+    </w:p>
+    <w:p>
+      <w:pPr>
+        <w:spacing w:after="0" w:line="240" w:lineRule="auto"/>
+        <w:jc w:val="both"/>
         <w:rPr>
           <w:rFonts w:ascii="Arial" w:hAnsi="Arial" w:cs="Arial"/>
           <w:color w:val="666666"/>
         </w:rPr>
-        <w:t>C</w:t>
-      </w:r>
-      <w:r>
-        <w:rPr>
-          <w:rFonts w:ascii="Arial" w:hAnsi="Arial" w:cs="Arial"/>
-          <w:color w:val="666666"/>
-        </w:rPr>
-        <w:t>O</w:t>
-      </w:r>
-      <w:r>
-        <w:rPr>
-          <w:rFonts w:ascii="Arial" w:hAnsi="Arial" w:cs="Arial"/>
-          <w:color w:val="666666"/>
-        </w:rPr>
-        <w:t>d</w:t>
-      </w:r>
-      <w:r>
-        <w:rPr>
-          <w:rFonts w:ascii="Arial" w:hAnsi="Arial" w:cs="Arial"/>
-          <w:color w:val="666666"/>
-        </w:rPr>
-        <w:t>A</w:t>
-      </w:r>
-      <w:proofErr w:type="spellEnd"/>
-      <w:r>
-        <w:rPr>
-          <w:rFonts w:ascii="Arial" w:hAnsi="Arial" w:cs="Arial"/>
-          <w:color w:val="666666"/>
-        </w:rPr>
-        <w:t xml:space="preserve"> ad</w:t>
-      </w:r>
-      <w:r>
-        <w:rPr>
-          <w:rFonts w:ascii="Arial" w:hAnsi="Arial" w:cs="Arial"/>
-          <w:color w:val="666666"/>
-        </w:rPr>
-        <w:t xml:space="preserve">aptado por </w:t>
-      </w:r>
-      <w:proofErr w:type="spellStart"/>
-      <w:r>
-        <w:rPr>
-          <w:rFonts w:ascii="Arial" w:hAnsi="Arial" w:cs="Arial"/>
-          <w:color w:val="666666"/>
-        </w:rPr>
-        <w:t>Dajer</w:t>
-      </w:r>
-      <w:proofErr w:type="spellEnd"/>
-      <w:r>
-        <w:rPr>
-          <w:rFonts w:ascii="Arial" w:hAnsi="Arial" w:cs="Arial"/>
-          <w:color w:val="666666"/>
-        </w:rPr>
-        <w:t xml:space="preserve"> (2021)</w:t>
-      </w:r>
+      </w:pPr>
     </w:p>
     <w:p>
       <w:pPr>
@@ -3414,9 +3166,15 @@
         <w:jc w:val="both"/>
         <w:rPr>
           <w:rFonts w:ascii="Arial" w:hAnsi="Arial" w:cs="Arial"/>
-          <w:color w:val="666666"/>
-        </w:rPr>
-      </w:pPr>
+        </w:rPr>
+      </w:pPr>
+      <w:bookmarkStart w:id="1" w:name="_Hlk147091919"/>
+      <w:r>
+        <w:rPr>
+          <w:rFonts w:ascii="Arial" w:hAnsi="Arial" w:cs="Arial"/>
+        </w:rPr>
+        <w:t>Ventajas de la aplicación del modelo de evaluación: Lenguaje cercano al docente y descriptores guía claros que permiten una evaluación ágil y con baja subjetividad.</w:t>
+      </w:r>
     </w:p>
     <w:p>
       <w:pPr>
@@ -3426,43 +3184,6 @@
           <w:rFonts w:ascii="Arial" w:hAnsi="Arial" w:cs="Arial"/>
         </w:rPr>
       </w:pPr>
-      <w:bookmarkStart w:id="1" w:name="_Hlk147091919"/>
-      <w:r>
-        <w:rPr>
-          <w:rFonts w:ascii="Arial" w:hAnsi="Arial" w:cs="Arial"/>
-        </w:rPr>
-        <w:t xml:space="preserve">Ventajas de la aplicación del </w:t>
-      </w:r>
-      <w:r>
-        <w:rPr>
-          <w:rFonts w:ascii="Arial" w:hAnsi="Arial" w:cs="Arial"/>
-        </w:rPr>
-        <w:t>m</w:t>
-      </w:r>
-      <w:r>
-        <w:rPr>
-          <w:rFonts w:ascii="Arial" w:hAnsi="Arial" w:cs="Arial"/>
-        </w:rPr>
-        <w:t xml:space="preserve">odelo de </w:t>
-      </w:r>
-      <w:r>
-        <w:rPr>
-          <w:rFonts w:ascii="Arial" w:hAnsi="Arial" w:cs="Arial"/>
-        </w:rPr>
-        <w:t>e</w:t>
-      </w:r>
-      <w:r>
-        <w:rPr>
-          <w:rFonts w:ascii="Arial" w:hAnsi="Arial" w:cs="Arial"/>
-        </w:rPr>
-        <w:t>valuación</w:t>
-      </w:r>
-      <w:r>
-        <w:rPr>
-          <w:rFonts w:ascii="Arial" w:hAnsi="Arial" w:cs="Arial"/>
-        </w:rPr>
-        <w:t>:</w:t>
-      </w:r>
     </w:p>
     <w:p>
       <w:pPr>
@@ -3481,50 +3202,11 @@
           <w:rFonts w:ascii="Arial" w:hAnsi="Arial" w:cs="Arial"/>
         </w:rPr>
       </w:pPr>
-    </w:p>
-    <w:p>
-      <w:pPr>
-        <w:spacing w:after="0" w:line="240" w:lineRule="auto"/>
-        <w:jc w:val="both"/>
+      <w:r>
         <w:rPr>
           <w:rFonts w:ascii="Arial" w:hAnsi="Arial" w:cs="Arial"/>
         </w:rPr>
-      </w:pPr>
-      <w:r>
-        <w:rPr>
-          <w:rFonts w:ascii="Arial" w:hAnsi="Arial" w:cs="Arial"/>
-        </w:rPr>
-        <w:t xml:space="preserve">Desventajas de la aplicación del </w:t>
-      </w:r>
-      <w:r>
-        <w:rPr>
-          <w:rFonts w:ascii="Arial" w:hAnsi="Arial" w:cs="Arial"/>
-        </w:rPr>
-        <w:t>m</w:t>
-      </w:r>
-      <w:r>
-        <w:rPr>
-          <w:rFonts w:ascii="Arial" w:hAnsi="Arial" w:cs="Arial"/>
-        </w:rPr>
-        <w:t xml:space="preserve">odelo de </w:t>
-      </w:r>
-      <w:r>
-        <w:rPr>
-          <w:rFonts w:ascii="Arial" w:hAnsi="Arial" w:cs="Arial"/>
-        </w:rPr>
-        <w:t>e</w:t>
-      </w:r>
-      <w:r>
-        <w:rPr>
-          <w:rFonts w:ascii="Arial" w:hAnsi="Arial" w:cs="Arial"/>
-        </w:rPr>
-        <w:t>valuaci</w:t>
-      </w:r>
-      <w:r>
-        <w:rPr>
-          <w:rFonts w:ascii="Arial" w:hAnsi="Arial" w:cs="Arial"/>
-        </w:rPr>
-        <w:t>ón:</w:t>
+        <w:t>Desventajas de la aplicación del modelo de evaluación: Profundidad limitada para valorar la exactitud técnica de simulaciones complejas, lo que motiva el rediseño hacia el modelo COdA-IP.</w:t>
       </w:r>
       <w:bookmarkEnd w:id="1"/>
     </w:p>

</xml_diff>